<commit_message>
Corrigir referências de parágrafos: remover § confuso, usar 'second subparagraph' em inglês. Reescrever nota de rodapé para clarificar blocos [PRAZO]
</commit_message>
<xml_diff>
--- a/tabela_prazos_regulamento_extenso.docx
+++ b/tabela_prazos_regulamento_extenso.docx
@@ -5377,7 +5377,7 @@
                 <w:color w:val="1F4E79"/>
                 <w:sz w:val="16"/>
               </w:rPr>
-              <w:t>Art. 23(4), 2.º §,</w:t>
+              <w:t>Art. 23(4), second subparagraph,</w:t>
               <w:br/>
             </w:r>
             <w:r>
@@ -5734,7 +5734,7 @@
                 <w:color w:val="1F4E79"/>
                 <w:sz w:val="16"/>
               </w:rPr>
-              <w:t>Art. 23(4), 2.º §,</w:t>
+              <w:t>Art. 23(4), second subparagraph,</w:t>
               <w:br/>
             </w:r>
             <w:r>
@@ -6528,7 +6528,7 @@
                 <w:color w:val="1F4E79"/>
                 <w:sz w:val="16"/>
               </w:rPr>
-              <w:t>Art. 21(3) 2.º § +</w:t>
+              <w:t>Art. 21(3), 2.º parágrafo +</w:t>
               <w:br/>
               <w:br/>
             </w:r>
@@ -8757,7 +8757,8 @@
                 <w:color w:val="1F4E79"/>
                 <w:sz w:val="16"/>
               </w:rPr>
-              <w:t>Art. 26(4), 5.º §</w:t>
+              <w:t>Art. 26(4),</w:t>
+              <w:br/>
               <w:br/>
             </w:r>
             <w:r>
@@ -8766,7 +8767,15 @@
                 <w:color w:val="808080"/>
                 <w:sz w:val="13"/>
               </w:rPr>
-              <w:t>(atos de execução)</w:t>
+              <w:t>atos de execução</w:t>
+            </w:r>
+            <w:r>
+              <w:rPr>
+                <w:i/>
+                <w:color w:val="808080"/>
+                <w:sz w:val="13"/>
+              </w:rPr>
+              <w:t>(5.º parágrafo)</w:t>
             </w:r>
           </w:p>
           <w:p>
@@ -10647,7 +10656,7 @@
           <w:color w:val="808080"/>
           <w:sz w:val="15"/>
         </w:rPr>
-        <w:t>Nota: Texto verbatim em inglês conforme Regulamento 2023/0447 (versão de 11.12.2025). Os prazos em anos são relativos à data de entrada em vigor. As datas 1 Jul. 2030 e 1 Jul. 2036 são absolutas (Art. 33, ponto iii). Blocos [PRAZO] em azul indicam que o prazo está numa norma diferente da norma substantiva.</w:t>
+        <w:t>Nota: Texto verbatim em inglês conforme Regulamento 2023/0447 (versão de 11.12.2025). Os prazos em anos são contados a partir da entrada em vigor (vigésimo dia após publicação no JOUE). As datas 1 Jul. 2030 e 1 Jul. 2036 são absolutas (Art. 33, ponto iii). Quando há um bloco [PRAZO] separado, o prazo vem de Art. 33 (disposições gerais de aplicação); quando não há, o prazo está embutido no próprio artigo.</w:t>
       </w:r>
     </w:p>
     <w:sectPr>

</xml_diff>